<commit_message>
Revisa E1 de Dados e Engenharia e prepara validação no Colab
</commit_message>
<xml_diff>
--- a/documentos/Entrega 1/ES e ML/E1_Engenharia_Software_CTI.docx
+++ b/documentos/Entrega 1/ES e ML/E1_Engenharia_Software_CTI.docx
@@ -311,8 +311,8 @@
         <w:tblLook w:firstColumn="1" w:firstRow="1" w:lastColumn="0" w:lastRow="0" w:noHBand="0" w:noVBand="1" w:val="04A0"/>
       </w:tblPr>
       <w:tblGrid>
-        <w:gridCol w:w="4759"/>
-        <w:gridCol w:w="4759"/>
+        <w:gridCol w:w="2268"/>
+        <w:gridCol w:w="6917"/>
       </w:tblGrid>
       <w:tr>
         <w:trPr>
@@ -457,8 +457,8 @@
         <w:tblLook w:firstColumn="1" w:firstRow="1" w:lastColumn="0" w:lastRow="0" w:noHBand="0" w:noVBand="1" w:val="04A0"/>
       </w:tblPr>
       <w:tblGrid>
-        <w:gridCol w:w="4759"/>
-        <w:gridCol w:w="4759"/>
+        <w:gridCol w:w="2268"/>
+        <w:gridCol w:w="6917"/>
       </w:tblGrid>
       <w:tr>
         <w:trPr>
@@ -728,8 +728,8 @@
         <w:tblLook w:firstColumn="1" w:firstRow="1" w:lastColumn="0" w:lastRow="0" w:noHBand="0" w:noVBand="1" w:val="04A0"/>
       </w:tblPr>
       <w:tblGrid>
-        <w:gridCol w:w="4759"/>
-        <w:gridCol w:w="4759"/>
+        <w:gridCol w:w="1701"/>
+        <w:gridCol w:w="7483"/>
       </w:tblGrid>
       <w:tr>
         <w:trPr>
@@ -969,7 +969,7 @@
         <w:rPr>
           <w:b w:val="0"/>
         </w:rPr>
-        <w:t>A aplicação do método aparece no repositório: o trabalho foi entregue em incrementos pequenos e verificáveis, um commit por resultado, entre 21 de agosto e 22 de setembro. A etapa de revisão impediu duas vezes que um item fosse dado como concluído. Na primeira, uma verificação contábil errada foi corrigida antes de virar achado; o caso está na seção 12. Na segunda, a revisão cruzada de 22 de setembro devolveu a entrega de Ciência de Dados para Em andamento: o relatório tinha conclusões que os dados não sustentavam, e os notebooks exibiam linhas da base num repositório público. As duas correções estão no histórico de commits.</w:t>
+        <w:t>A aplicação do método aparece no repositório: o trabalho foi entregue em incrementos pequenos e verificáveis, um commit por resultado, entre 21 de agosto e 22 de setembro. A etapa de revisão impediu duas vezes que um item fosse dado como concluído. Na primeira, uma verificação contábil errada foi corrigida antes de virar achado; o caso está na seção 12. Na segunda, a revisão cruzada de 22 de setembro devolveu a entrega de Ciência de Dados para Em andamento: o relatório tinha conclusões que os dados não sustentavam, e os notebooks exibiam linhas da base num repositório público. As duas correções estão no histórico de commits. A partir de 24/09, os itens, responsáveis, estados, bloqueios e critérios de pronto estão registrados em backlog_E1.md, nesta pasta. Para alterar um requisito ou fórmula, registramos o ID afetado, o motivo, a data e o impacto; o responsável altera e outro integrante confere o artefato e o commit. Pontos que dependem da CTI ou do professor aguardam validação.</w:t>
       </w:r>
     </w:p>
     <w:p>
@@ -999,9 +999,9 @@
         <w:tblLook w:firstColumn="1" w:firstRow="1" w:lastColumn="0" w:lastRow="0" w:noHBand="0" w:noVBand="1" w:val="04A0"/>
       </w:tblPr>
       <w:tblGrid>
-        <w:gridCol w:w="3173"/>
-        <w:gridCol w:w="3173"/>
-        <w:gridCol w:w="3173"/>
+        <w:gridCol w:w="2268"/>
+        <w:gridCol w:w="3458"/>
+        <w:gridCol w:w="3458"/>
       </w:tblGrid>
       <w:tr>
         <w:trPr>
@@ -1344,9 +1344,9 @@
         <w:tblLook w:firstColumn="1" w:firstRow="1" w:lastColumn="0" w:lastRow="0" w:noHBand="0" w:noVBand="1" w:val="04A0"/>
       </w:tblPr>
       <w:tblGrid>
-        <w:gridCol w:w="3173"/>
-        <w:gridCol w:w="3173"/>
-        <w:gridCol w:w="3173"/>
+        <w:gridCol w:w="907"/>
+        <w:gridCol w:w="6236"/>
+        <w:gridCol w:w="2041"/>
       </w:tblGrid>
       <w:tr>
         <w:trPr>
@@ -1697,7 +1697,7 @@
         <w:rPr>
           <w:b w:val="0"/>
         </w:rPr>
-        <w:t>Os identificadores RF01 a RF14 mantêm a numeração do enunciado, que é a origem deles. O RF15 é uma extensão que nasceu da orientação da disciplina de Contabilidade e Finanças. A prioridade é alta para o que o enunciado exige nas entregas e média para o que ele pede quando aplicável ou que ainda depende de definição. A última coluna descreve o que existe no repositório em 22 de setembro de 2026.</w:t>
+        <w:t>Os identificadores RF01 a RF14 mantêm a numeração do enunciado, que é a origem deles. O RF15 é uma extensão que nasceu da orientação da disciplina de Contabilidade e Finanças. A prioridade é alta para o que o enunciado exige nas entregas e média para o que ele pede quando aplicável ou que ainda depende de definição. A última coluna descreve o que existe no repositório até 24 de setembro de 2026.</w:t>
       </w:r>
     </w:p>
     <w:tbl>
@@ -1708,12 +1708,12 @@
         <w:tblLook w:firstColumn="1" w:firstRow="1" w:lastColumn="0" w:lastRow="0" w:noHBand="0" w:noVBand="1" w:val="04A0"/>
       </w:tblPr>
       <w:tblGrid>
-        <w:gridCol w:w="1586"/>
-        <w:gridCol w:w="1586"/>
-        <w:gridCol w:w="1586"/>
-        <w:gridCol w:w="1586"/>
-        <w:gridCol w:w="1586"/>
-        <w:gridCol w:w="1586"/>
+        <w:gridCol w:w="680"/>
+        <w:gridCol w:w="4025"/>
+        <w:gridCol w:w="1134"/>
+        <w:gridCol w:w="1191"/>
+        <w:gridCol w:w="907"/>
+        <w:gridCol w:w="1247"/>
       </w:tblGrid>
       <w:tr>
         <w:trPr>
@@ -2391,7 +2391,7 @@
               <w:rPr>
                 <w:sz w:val="18"/>
               </w:rPr>
-              <w:t>Ajustar um modelo de regressão, interpretar os coeficientes e avaliar ajuste, resíduos e limitações.</w:t>
+              <w:t>Ajustar um modelo de regressão, interpretar os coeficientes e avaliar ajuste, resíduos e limitações. Fica pronto quando o notebook reproduz o ajuste, justifica variáveis e unidade de análise, apresenta coeficientes, métricas, resíduos e limitações e mantém trajetórias idênticas no mesmo conjunto de treino ou teste, quando houver separação.</w:t>
             </w:r>
           </w:p>
         </w:tc>
@@ -2569,7 +2569,7 @@
               <w:rPr>
                 <w:sz w:val="18"/>
               </w:rPr>
-              <w:t>Gerar relatórios com resultados, gráficos, interpretação, premissas, limitações e recomendações.</w:t>
+              <w:t>Gerar relatórios com resultados, gráficos, interpretação, premissas, limitações e recomendações. Fica pronto quando os resultados são reproduzidos pelos artefatos citados, com recorte, unidades, premissas, limitações e recomendações coerentes, após revisão de outro integrante.</w:t>
             </w:r>
           </w:p>
         </w:tc>
@@ -2658,7 +2658,7 @@
               <w:rPr>
                 <w:sz w:val="18"/>
               </w:rPr>
-              <w:t>Disponibilizar um painel com pelo menos cinco indicadores, gráficos, filtros e comparações.</w:t>
+              <w:t>Disponibilizar um painel com pelo menos cinco indicadores, gráficos, filtros e comparações. Fica pronto quando o painel publicado mostra pelo menos cinco indicadores e seus filtros e comparações reproduzem os valores de referência nos recortes testados.</w:t>
             </w:r>
           </w:p>
         </w:tc>
@@ -2747,7 +2747,7 @@
               <w:rPr>
                 <w:sz w:val="18"/>
               </w:rPr>
-              <w:t>Permitir análise de sensibilidade sobre uma premissa aprovada, preservando o cenário de referência.</w:t>
+              <w:t>Permitir análise de sensibilidade sobre uma premissa aprovada, preservando o cenário de referência. Fica pronto quando uma mudança na premissa aprovada recalcula os indicadores previstos, mostra a diferença para a referência e permite restaurá-la sem alterar a base original.</w:t>
             </w:r>
           </w:p>
         </w:tc>
@@ -2836,7 +2836,7 @@
               <w:rPr>
                 <w:sz w:val="18"/>
               </w:rPr>
-              <w:t>Exportar tabelas e resultados autorizados, sem expor conteúdo restrito.</w:t>
+              <w:t>Exportar tabelas e resultados autorizados, sem expor conteúdo restrito. Fica pronto quando o arquivo exportado abre corretamente, mantém valores, unidades e recorte da visualização e contém somente informações autorizadas.</w:t>
             </w:r>
           </w:p>
         </w:tc>
@@ -2925,7 +2925,7 @@
               <w:rPr>
                 <w:sz w:val="18"/>
               </w:rPr>
-              <w:t>Exibir fonte, data de atualização, unidade e fórmula dos principais indicadores.</w:t>
+              <w:t>Exibir fonte, data de atualização, unidade e fórmula dos principais indicadores. Fica pronto quando cada indicador principal mostra fonte, data de atualização, unidade e fórmula ou descrição, coerentes com o dicionário de KPIs.</w:t>
             </w:r>
           </w:p>
         </w:tc>
@@ -3014,7 +3014,7 @@
               <w:rPr>
                 <w:sz w:val="18"/>
               </w:rPr>
-              <w:t>Fornecer código, dependências e instruções de execução e, na Entrega 2, publicar o painel na nuvem.</w:t>
+              <w:t>Fornecer código, dependências e instruções de execução e, na Entrega 2, publicar o painel na nuvem. Na E1, fica pronto quando outro integrante executa os notebooks no Colab e reproduz as verificações. Na E2, exige também painel acessível no endereço publicado, com o fluxo principal testado.</w:t>
             </w:r>
           </w:p>
         </w:tc>
@@ -3185,8 +3185,8 @@
         <w:tblLook w:firstColumn="1" w:firstRow="1" w:lastColumn="0" w:lastRow="0" w:noHBand="0" w:noVBand="1" w:val="04A0"/>
       </w:tblPr>
       <w:tblGrid>
-        <w:gridCol w:w="4759"/>
-        <w:gridCol w:w="4759"/>
+        <w:gridCol w:w="2381"/>
+        <w:gridCol w:w="6803"/>
       </w:tblGrid>
       <w:tr>
         <w:trPr>
@@ -3581,8 +3581,8 @@
         <w:tblLook w:firstColumn="1" w:firstRow="1" w:lastColumn="0" w:lastRow="0" w:noHBand="0" w:noVBand="1" w:val="04A0"/>
       </w:tblPr>
       <w:tblGrid>
-        <w:gridCol w:w="4759"/>
-        <w:gridCol w:w="4759"/>
+        <w:gridCol w:w="850"/>
+        <w:gridCol w:w="8334"/>
       </w:tblGrid>
       <w:tr>
         <w:trPr>
@@ -4076,10 +4076,10 @@
         <w:tblLook w:firstColumn="1" w:firstRow="1" w:lastColumn="0" w:lastRow="0" w:noHBand="0" w:noVBand="1" w:val="04A0"/>
       </w:tblPr>
       <w:tblGrid>
-        <w:gridCol w:w="2379"/>
-        <w:gridCol w:w="2379"/>
-        <w:gridCol w:w="2379"/>
-        <w:gridCol w:w="2379"/>
+        <w:gridCol w:w="1361"/>
+        <w:gridCol w:w="2268"/>
+        <w:gridCol w:w="2948"/>
+        <w:gridCol w:w="2608"/>
       </w:tblGrid>
       <w:tr>
         <w:trPr>
@@ -4606,10 +4606,10 @@
         <w:tblLook w:firstColumn="1" w:firstRow="1" w:lastColumn="0" w:lastRow="0" w:noHBand="0" w:noVBand="1" w:val="04A0"/>
       </w:tblPr>
       <w:tblGrid>
-        <w:gridCol w:w="2379"/>
-        <w:gridCol w:w="2379"/>
-        <w:gridCol w:w="2379"/>
-        <w:gridCol w:w="2379"/>
+        <w:gridCol w:w="1247"/>
+        <w:gridCol w:w="1474"/>
+        <w:gridCol w:w="3402"/>
+        <w:gridCol w:w="3061"/>
       </w:tblGrid>
       <w:tr>
         <w:trPr>
@@ -4666,7 +4666,7 @@
                 <w:b/>
                 <w:sz w:val="19"/>
               </w:rPr>
-              <w:t>Artefato atual</w:t>
+              <w:t>Artefato atual ou previsto</w:t>
             </w:r>
           </w:p>
         </w:tc>
@@ -4813,7 +4813,7 @@
               <w:rPr>
                 <w:sz w:val="18"/>
               </w:rPr>
-              <w:t>Notebook 01 (percentis, dispersão e distribuição do resultado) e entrega de Análise Inferencial</w:t>
+              <w:t>Notebook 01 (percentis, dispersão e distribuição do resultado) e entrega de Análise Inferencial (prevista para E1, a integrar)</w:t>
             </w:r>
           </w:p>
         </w:tc>
@@ -4886,7 +4886,7 @@
               <w:rPr>
                 <w:sz w:val="18"/>
               </w:rPr>
-              <w:t>Dicionário de KPIs e planilha de validação da entrega de Contabilidade e Finanças</w:t>
+              <w:t>Dicionário de KPIs e planilha de validação da entrega de Contabilidade e Finanças (prevista para E1, a integrar)</w:t>
             </w:r>
           </w:p>
         </w:tc>
@@ -4959,7 +4959,7 @@
               <w:rPr>
                 <w:sz w:val="18"/>
               </w:rPr>
-              <w:t>Relatórios da Entrega 1; painel e relatórios finais na Entrega 2</w:t>
+              <w:t>Relatórios da Entrega 1; painel e relatórios finais previstos para a Entrega 2</w:t>
             </w:r>
           </w:p>
         </w:tc>
@@ -5023,7 +5023,7 @@
               <w:rPr>
                 <w:sz w:val="18"/>
               </w:rPr>
-              <w:t>Arquivo requirements.txt, README e células de execução no Colab dos notebooks</w:t>
+              <w:t>Arquivo requirements.txt, README e células de execução dos notebooks no Colab (teste real pendente)</w:t>
             </w:r>
           </w:p>
         </w:tc>
@@ -5130,10 +5130,10 @@
         <w:tblLook w:firstColumn="1" w:firstRow="1" w:lastColumn="0" w:lastRow="0" w:noHBand="0" w:noVBand="1" w:val="04A0"/>
       </w:tblPr>
       <w:tblGrid>
-        <w:gridCol w:w="2379"/>
-        <w:gridCol w:w="2379"/>
-        <w:gridCol w:w="2379"/>
-        <w:gridCol w:w="2379"/>
+        <w:gridCol w:w="1474"/>
+        <w:gridCol w:w="1928"/>
+        <w:gridCol w:w="3402"/>
+        <w:gridCol w:w="2381"/>
       </w:tblGrid>
       <w:tr>
         <w:trPr>
@@ -5547,7 +5547,7 @@
               <w:rPr>
                 <w:sz w:val="18"/>
               </w:rPr>
-              <w:t>Commits por resultado e revisão cruzada antes da entrega, com o quadro de tarefas ainda informal</w:t>
+              <w:t>Commits por resultado, revisão cruzada e backlog_E1.md com estados, responsáveis, critérios e bloqueios</w:t>
             </w:r>
           </w:p>
         </w:tc>
@@ -5561,7 +5561,7 @@
               <w:rPr>
                 <w:sz w:val="18"/>
               </w:rPr>
-              <w:t>Formalizar o quadro no GitHub Projects</w:t>
+              <w:t>Confirmar responsáveis e evidências com o grupo; migrar ao GitHub Projects na E2</w:t>
             </w:r>
           </w:p>
         </w:tc>
@@ -5587,9 +5587,9 @@
         <w:tblLook w:firstColumn="1" w:firstRow="1" w:lastColumn="0" w:lastRow="0" w:noHBand="0" w:noVBand="1" w:val="04A0"/>
       </w:tblPr>
       <w:tblGrid>
-        <w:gridCol w:w="3173"/>
-        <w:gridCol w:w="3173"/>
-        <w:gridCol w:w="3173"/>
+        <w:gridCol w:w="2494"/>
+        <w:gridCol w:w="3175"/>
+        <w:gridCol w:w="3515"/>
       </w:tblGrid>
       <w:tr>
         <w:trPr>
@@ -5980,7 +5980,7 @@
         <w:rPr>
           <w:b w:val="0"/>
         </w:rPr>
-        <w:t>Para a Entrega 2, pretendemos formalizar o quadro de tarefas no GitHub Projects, registrar as decisões técnicas em arquivo versionado e manter a rastreabilidade entre requisito, artefato e verificação conforme a implementação avança.</w:t>
+        <w:t>Para a Entrega 2, pretendemos migrar o backlog versionado para o GitHub Projects e ampliar o registro de decisões técnicas e manter a rastreabilidade entre requisito, artefato e verificação conforme a implementação avança.</w:t>
       </w:r>
     </w:p>
     <w:p>

</xml_diff>

<commit_message>
Registra validação real no Colab e sincroniza evidências da E1
</commit_message>
<xml_diff>
--- a/documentos/Entrega 1/ES e ML/E1_Engenharia_Software_CTI.docx
+++ b/documentos/Entrega 1/ES e ML/E1_Engenharia_Software_CTI.docx
@@ -5023,7 +5023,7 @@
               <w:rPr>
                 <w:sz w:val="18"/>
               </w:rPr>
-              <w:t>Arquivo requirements.txt, README e células de execução dos notebooks no Colab (teste real pendente)</w:t>
+              <w:t>Arquivo requirements.txt, README e notebooks no Colab (teste técnico aprovado; revisão independente pendente)</w:t>
             </w:r>
           </w:p>
         </w:tc>
@@ -5354,7 +5354,7 @@
               <w:rPr>
                 <w:sz w:val="18"/>
               </w:rPr>
-              <w:t>Executar os notebooks no Colab por outro integrante</w:t>
+              <w:t>Revisão independente dos resultados no Colab</w:t>
             </w:r>
           </w:p>
         </w:tc>

</xml_diff>